<commit_message>
data pulls and i&w modifications
</commit_message>
<xml_diff>
--- a/notebooks/I&W Reporting/I&W Report Template.docx
+++ b/notebooks/I&W Reporting/I&W Report Template.docx
@@ -29,21 +29,6 @@
         </w:rPr>
         <w:t xml:space="preserve"> </w:t>
       </w:r>
-      <w:r>
-        <w:t>HTOC—</w:t>
-      </w:r>
-      <w:r>
-        <w:t>{{country}}</w:t>
-      </w:r>
-      <w:r>
-        <w:t xml:space="preserve"> IP Address Previously Used by Russian SVR Midnight Blizzard Seen in Observations for </w:t>
-      </w:r>
-      <w:r>
-        <w:t>{{observed_count}}</w:t>
-      </w:r>
-      <w:r>
-        <w:t xml:space="preserve"> HTOC Partners, March 2025/I&amp;W-20250331-1043-A</w:t>
-      </w:r>
     </w:p>
     <w:p>
       <w:pPr>
@@ -95,191 +80,6 @@
       </w:r>
     </w:p>
     <w:p/>
-    <w:p>
-      <w:r>
-        <w:t>{{</w:t>
-      </w:r>
-      <w:r>
-        <w:t>ip_address</w:t>
-      </w:r>
-      <w:r>
-        <w:t>}}</w:t>
-      </w:r>
-      <w:r>
-        <w:t xml:space="preserve"> </w:t>
-      </w:r>
-      <w:r>
-        <w:t xml:space="preserve">resolves to the </w:t>
-      </w:r>
-      <w:r>
-        <w:t xml:space="preserve">{{country}} </w:t>
-      </w:r>
-      <w:r>
-        <w:t xml:space="preserve">under </w:t>
-      </w:r>
-      <w:r>
-        <w:t xml:space="preserve">ASN </w:t>
-      </w:r>
-      <w:r>
-        <w:t>{{asn_number}}</w:t>
-      </w:r>
-      <w:r>
-        <w:t xml:space="preserve"> {{as_owner}}</w:t>
-      </w:r>
-      <w:r>
-        <w:t xml:space="preserve">, with reverse DNS resolution to domain of unknown reputation </w:t>
-      </w:r>
-      <w:r>
-        <w:t>108-174-58-28-host.colocrossing</w:t>
-      </w:r>
-      <w:r>
-        <w:t>[</w:t>
-      </w:r>
-      <w:r>
-        <w:t>.</w:t>
-      </w:r>
-      <w:r>
-        <w:t>]</w:t>
-      </w:r>
-      <w:r>
-        <w:t>com</w:t>
-      </w:r>
-      <w:r>
-        <w:t xml:space="preserve">. </w:t>
-      </w:r>
-      <w:r>
-        <w:t>{{</w:t>
-      </w:r>
-      <w:r>
-        <w:t>ip_address</w:t>
-      </w:r>
-      <w:r>
-        <w:t>}}</w:t>
-      </w:r>
-      <w:r>
-        <w:t xml:space="preserve"> </w:t>
-      </w:r>
-      <w:r>
-        <w:t xml:space="preserve">reported by CISA on 3 July 2024 as an indicator in a </w:t>
-      </w:r>
-      <w:r>
-        <w:t>RegreSSHion OpenSSH</w:t>
-      </w:r>
-      <w:r>
-        <w:t xml:space="preserve"> </w:t>
-      </w:r>
-      <w:r>
-        <w:t>CVE-2024-6387</w:t>
-      </w:r>
-      <w:r>
-        <w:t xml:space="preserve"> exploitation campaign targeting the healthcare public health (HPH) sector. According to AlienVault OTX, </w:t>
-      </w:r>
-      <w:r>
-        <w:t>{{</w:t>
-      </w:r>
-      <w:r>
-        <w:t>ip_address</w:t>
-      </w:r>
-      <w:r>
-        <w:t>}}</w:t>
-      </w:r>
-      <w:r>
-        <w:t xml:space="preserve"> </w:t>
-      </w:r>
-      <w:r>
-        <w:t xml:space="preserve">is possibly malicious, has ports </w:t>
-      </w:r>
-      <w:r>
-        <w:t>{{ports}}</w:t>
-      </w:r>
-      <w:r>
-        <w:t xml:space="preserve"> open, and was possibly an indicator in a Mirai botnet campaign in July 2024. Nineteen security vendors label </w:t>
-      </w:r>
-      <w:r>
-        <w:t>{{</w:t>
-      </w:r>
-      <w:r>
-        <w:t>ip_address</w:t>
-      </w:r>
-      <w:r>
-        <w:t>}}</w:t>
-      </w:r>
-      <w:r>
-        <w:t xml:space="preserve"> </w:t>
-      </w:r>
-      <w:r>
-        <w:t xml:space="preserve">as a malicious node in VirusTotal. According to Mandiant, </w:t>
-      </w:r>
-      <w:r>
-        <w:t>{{</w:t>
-      </w:r>
-      <w:r>
-        <w:t>ip_address</w:t>
-      </w:r>
-      <w:r>
-        <w:t>}}</w:t>
-      </w:r>
-      <w:r>
-        <w:t xml:space="preserve"> </w:t>
-      </w:r>
-      <w:r>
-        <w:t>is likely malicious, last seen 27 July conducting vulnerability and exploit scanning, and as a malware download location on 11 July.</w:t>
-      </w:r>
-    </w:p>
-    <w:p/>
-    <w:p>
-      <w:r>
-        <w:t xml:space="preserve">On </w:t>
-      </w:r>
-      <w:r>
-        <w:t>1 and 2 August</w:t>
-      </w:r>
-      <w:r>
-        <w:t xml:space="preserve"> 2024</w:t>
-      </w:r>
-      <w:r>
-        <w:t>,</w:t>
-      </w:r>
-      <w:r>
-        <w:t xml:space="preserve"> </w:t>
-      </w:r>
-      <w:r>
-        <w:t xml:space="preserve">an indicator associated with </w:t>
-      </w:r>
-      <w:r>
-        <w:t xml:space="preserve">a </w:t>
-      </w:r>
-      <w:r>
-        <w:t>RegreSSHion OpenSSH</w:t>
-      </w:r>
-      <w:r>
-        <w:t xml:space="preserve"> </w:t>
-      </w:r>
-      <w:r>
-        <w:t>CVE-2024-6387</w:t>
-      </w:r>
-      <w:r>
-        <w:t xml:space="preserve"> exploitation campaign targeting the HPH sector </w:t>
-      </w:r>
-      <w:r>
-        <w:t xml:space="preserve">was observed across </w:t>
-      </w:r>
-      <w:r>
-        <w:t>X</w:t>
-      </w:r>
-      <w:r>
-        <w:t xml:space="preserve"> </w:t>
-      </w:r>
-      <w:r>
-        <w:t>HTOC partner networks</w:t>
-      </w:r>
-      <w:r>
-        <w:t xml:space="preserve">: </w:t>
-      </w:r>
-      <w:r>
-        <w:t>{{observed_by}}</w:t>
-      </w:r>
-    </w:p>
     <w:p/>
     <w:p/>
     <w:p>
@@ -399,6 +199,7 @@
                 <w:szCs w:val="16"/>
               </w:rPr>
             </w:pPr>
+            <w:proofErr w:type="spellStart"/>
             <w:r>
               <w:rPr>
                 <w:b/>
@@ -417,6 +218,7 @@
               </w:rPr>
               <w:t>Type</w:t>
             </w:r>
+            <w:proofErr w:type="spellEnd"/>
           </w:p>
         </w:tc>
         <w:tc>
@@ -528,9 +330,11 @@
             <w:r>
               <w:t>{{</w:t>
             </w:r>
+            <w:proofErr w:type="spellStart"/>
             <w:r>
               <w:t>ip_address</w:t>
             </w:r>
+            <w:proofErr w:type="spellEnd"/>
             <w:r>
               <w:t>}}</w:t>
             </w:r>
@@ -552,7 +356,15 @@
                 <w:sz w:val="16"/>
                 <w:szCs w:val="16"/>
               </w:rPr>
-              <w:t>{{indicator_type</w:t>
+              <w:t>{{</w:t>
+            </w:r>
+            <w:proofErr w:type="spellStart"/>
+            <w:r>
+              <w:rPr>
+                <w:sz w:val="16"/>
+                <w:szCs w:val="16"/>
+              </w:rPr>
+              <w:t>indicator_type</w:t>
             </w:r>
             <w:r>
               <w:rPr>
@@ -561,6 +373,7 @@
               </w:rPr>
               <w:t>s</w:t>
             </w:r>
+            <w:proofErr w:type="spellEnd"/>
             <w:r>
               <w:rPr>
                 <w:sz w:val="16"/>
@@ -594,7 +407,23 @@
                 <w:sz w:val="16"/>
                 <w:szCs w:val="16"/>
               </w:rPr>
-              <w:t>{{date_observed}}</w:t>
+              <w:t>{{</w:t>
+            </w:r>
+            <w:proofErr w:type="spellStart"/>
+            <w:r>
+              <w:rPr>
+                <w:sz w:val="16"/>
+                <w:szCs w:val="16"/>
+              </w:rPr>
+              <w:t>date_observed</w:t>
+            </w:r>
+            <w:proofErr w:type="spellEnd"/>
+            <w:r>
+              <w:rPr>
+                <w:sz w:val="16"/>
+                <w:szCs w:val="16"/>
+              </w:rPr>
+              <w:t>}}</w:t>
             </w:r>
           </w:p>
           <w:p>
@@ -622,7 +451,23 @@
                 <w:sz w:val="16"/>
                 <w:szCs w:val="16"/>
               </w:rPr>
-              <w:t>{{observed_by}}</w:t>
+              <w:t>{{</w:t>
+            </w:r>
+            <w:proofErr w:type="spellStart"/>
+            <w:r>
+              <w:rPr>
+                <w:sz w:val="16"/>
+                <w:szCs w:val="16"/>
+              </w:rPr>
+              <w:t>observed_by</w:t>
+            </w:r>
+            <w:proofErr w:type="spellEnd"/>
+            <w:r>
+              <w:rPr>
+                <w:sz w:val="16"/>
+                <w:szCs w:val="16"/>
+              </w:rPr>
+              <w:t>}}</w:t>
             </w:r>
           </w:p>
           <w:p>
@@ -645,27 +490,6 @@
                 <w:szCs w:val="16"/>
               </w:rPr>
             </w:pPr>
-            <w:r>
-              <w:rPr>
-                <w:sz w:val="16"/>
-                <w:szCs w:val="16"/>
-              </w:rPr>
-              <w:t xml:space="preserve">IP was reported by CISA in July 2024 as an indicator in </w:t>
-            </w:r>
-            <w:r>
-              <w:rPr>
-                <w:sz w:val="16"/>
-                <w:szCs w:val="16"/>
-              </w:rPr>
-              <w:t>a RegreSSHion OpenSSH CVE-2024-6387 exploitation campaign targeting the HPH sector</w:t>
-            </w:r>
-            <w:r>
-              <w:rPr>
-                <w:sz w:val="16"/>
-                <w:szCs w:val="16"/>
-              </w:rPr>
-              <w:t>.</w:t>
-            </w:r>
           </w:p>
         </w:tc>
       </w:tr>
@@ -761,16 +585,25 @@
           <w:i/>
           <w:color w:val="808080" w:themeColor="background1" w:themeShade="80"/>
         </w:rPr>
-        <w:t xml:space="preserve">These reported observations are indicative of the indicator being detected within the observed entity's security logs.  Observations do not take into account any blocking actions or other mitigating controls, </w:t>
-      </w:r>
+        <w:t xml:space="preserve">These reported observations are indicative of the indicator being detected within the observed entity's security logs.  Observations do not take into account any blocking actions or other mitigating </w:t>
+      </w:r>
+      <w:proofErr w:type="gramStart"/>
       <w:r>
         <w:rPr>
           <w:bCs/>
           <w:i/>
           <w:color w:val="808080" w:themeColor="background1" w:themeShade="80"/>
         </w:rPr>
-        <w:lastRenderedPageBreak/>
-        <w:t>and are not proof of infection or compromise. HTOC recommends this observation be investigated to determine if associated with malicious activity or related to the previously reported malicious activity correlated to the indicator.</w:t>
+        <w:t>controls, and</w:t>
+      </w:r>
+      <w:proofErr w:type="gramEnd"/>
+      <w:r>
+        <w:rPr>
+          <w:bCs/>
+          <w:i/>
+          <w:color w:val="808080" w:themeColor="background1" w:themeShade="80"/>
+        </w:rPr>
+        <w:t xml:space="preserve"> are not proof of infection or compromise. HTOC recommends this observation be investigated to determine if associated with malicious activity or related to the previously reported malicious activity correlated to the indicator.</w:t>
       </w:r>
     </w:p>
     <w:p>
@@ -880,6 +713,7 @@
         <w:szCs w:val="24"/>
       </w:rPr>
     </w:pPr>
+    <w:proofErr w:type="gramStart"/>
     <w:r>
       <w:rPr>
         <w:b/>
@@ -890,6 +724,7 @@
       </w:rPr>
       <w:t>TLP:AMBER</w:t>
     </w:r>
+    <w:proofErr w:type="gramEnd"/>
   </w:p>
   <w:p>
     <w:pPr>
@@ -933,6 +768,7 @@
         <w:szCs w:val="24"/>
       </w:rPr>
     </w:pPr>
+    <w:proofErr w:type="gramStart"/>
     <w:r>
       <w:rPr>
         <w:b/>
@@ -943,6 +779,7 @@
       </w:rPr>
       <w:t>TLP:AMBER</w:t>
     </w:r>
+    <w:proofErr w:type="gramEnd"/>
   </w:p>
   <w:p>
     <w:pPr>
@@ -1512,6 +1349,7 @@
   <w:style w:type="character" w:default="1" w:styleId="DefaultParagraphFont">
     <w:name w:val="Default Paragraph Font"/>
     <w:uiPriority w:val="1"/>
+    <w:semiHidden/>
     <w:unhideWhenUsed/>
   </w:style>
   <w:style w:type="table" w:default="1" w:styleId="TableNormal">

</xml_diff>